<commit_message>
Add Reddit crawler tutorial and live Web3 dataset
</commit_message>
<xml_diff>
--- a/期末/web3_kg_project/docs/Web3_KG_How_To_Run.docx
+++ b/期末/web3_kg_project/docs/Web3_KG_How_To_Run.docx
@@ -1090,7 +1090,92 @@
         <w:pStyle w:val="Heading1"/>
       </w:pPr>
       <w:r>
-        <w:t>10. 常見問題</w:t>
+        <w:t>10. 從 Reddit 爬取 Web3 資料</w:t>
+      </w:r>
+    </w:p>
+    <w:p>
+      <w:r>
+        <w:t>本專案已提供不需要 API key 的 Reddit crawler，會使用 Reddit 公開 JSON endpoint。</w:t>
+      </w:r>
+    </w:p>
+    <w:p>
+      <w:r>
+        <w:t>執行：</w:t>
+      </w:r>
+    </w:p>
+    <w:p>
+      <w:pPr>
+        <w:spacing w:after="160"/>
+        <w:ind w:left="288"/>
+      </w:pPr>
+      <w:r>
+        <w:rPr>
+          <w:rFonts w:ascii="Consolas" w:hAnsi="Consolas" w:eastAsia="Consolas"/>
+          <w:sz w:val="18"/>
+        </w:rPr>
+        <w:t>python .\src\reddit_crawler.py --subreddits ethereum defi CryptoCurrency solana web3 NFT --posts-per-subreddit 15 --output .\data\reddit_web3_posts.csv</w:t>
+      </w:r>
+    </w:p>
+    <w:p>
+      <w:r>
+        <w:t>爬完後，用真實 Reddit 資料建立圖譜：</w:t>
+      </w:r>
+    </w:p>
+    <w:p>
+      <w:pPr>
+        <w:spacing w:after="160"/>
+        <w:ind w:left="288"/>
+      </w:pPr>
+      <w:r>
+        <w:rPr>
+          <w:rFonts w:ascii="Consolas" w:hAnsi="Consolas" w:eastAsia="Consolas"/>
+          <w:sz w:val="18"/>
+        </w:rPr>
+        <w:t>python .\src\pipeline.py --input .\data\reddit_web3_posts.csv --output .\outputs\reddit_live</w:t>
+      </w:r>
+    </w:p>
+    <w:p>
+      <w:r>
+        <w:t>打開 live graph：</w:t>
+      </w:r>
+    </w:p>
+    <w:p>
+      <w:pPr>
+        <w:spacing w:after="160"/>
+        <w:ind w:left="288"/>
+      </w:pPr>
+      <w:r>
+        <w:rPr>
+          <w:rFonts w:ascii="Consolas" w:hAnsi="Consolas" w:eastAsia="Consolas"/>
+          <w:sz w:val="18"/>
+        </w:rPr>
+        <w:t>http://localhost:8080/outputs/reddit_live/interactive_graph.html</w:t>
+      </w:r>
+    </w:p>
+    <w:p>
+      <w:r>
+        <w:t>如果你想學爬蟲程式怎麼寫，請打開：</w:t>
+      </w:r>
+    </w:p>
+    <w:p>
+      <w:pPr>
+        <w:spacing w:after="160"/>
+        <w:ind w:left="288"/>
+      </w:pPr>
+      <w:r>
+        <w:rPr>
+          <w:rFonts w:ascii="Consolas" w:hAnsi="Consolas" w:eastAsia="Consolas"/>
+          <w:sz w:val="18"/>
+        </w:rPr>
+        <w:t>docs/Reddit_Web3_Crawler_Tutorial.ipynb</w:t>
+      </w:r>
+    </w:p>
+    <w:p>
+      <w:pPr>
+        <w:pStyle w:val="Heading1"/>
+      </w:pPr>
+      <w:r>
+        <w:t>11. 常見問題</w:t>
       </w:r>
     </w:p>
     <w:p>
@@ -1209,10 +1294,36 @@
     </w:p>
     <w:p>
       <w:pPr>
+        <w:pStyle w:val="Heading2"/>
+      </w:pPr>
+      <w:r>
+        <w:t>問題 4：Reddit 暫時拒絕請求</w:t>
+      </w:r>
+    </w:p>
+    <w:p>
+      <w:r>
+        <w:t>請降低請求量，或增加等待時間：</w:t>
+      </w:r>
+    </w:p>
+    <w:p>
+      <w:pPr>
+        <w:spacing w:after="160"/>
+        <w:ind w:left="288"/>
+      </w:pPr>
+      <w:r>
+        <w:rPr>
+          <w:rFonts w:ascii="Consolas" w:hAnsi="Consolas" w:eastAsia="Consolas"/>
+          <w:sz w:val="18"/>
+        </w:rPr>
+        <w:t>python .\src\reddit_crawler.py --sleep-seconds 3 --posts-per-subreddit 8</w:t>
+      </w:r>
+    </w:p>
+    <w:p>
+      <w:pPr>
         <w:pStyle w:val="Heading1"/>
       </w:pPr>
       <w:r>
-        <w:t>11. 展示建議</w:t>
+        <w:t>12. 展示建議</w:t>
       </w:r>
     </w:p>
     <w:p>

</xml_diff>

<commit_message>
Update coursework files 2026-05-21 09:46:05
</commit_message>
<xml_diff>
--- a/期末/web3_kg_project/docs/Web3_KG_How_To_Run.docx
+++ b/期末/web3_kg_project/docs/Web3_KG_How_To_Run.docx
@@ -5,7 +5,6 @@
     <w:p>
       <w:pPr>
         <w:pStyle w:val="Title"/>
-        <w:jc w:val="center"/>
       </w:pPr>
       <w:r>
         <w:t>Web3 Knowledge Graph 運行教學</w:t>
@@ -39,7 +38,18 @@
         <w:pStyle w:val="ListNumber"/>
       </w:pPr>
       <w:r>
-        <w:t>讀取 data/sample_web3_posts.csv。</w:t>
+        <w:t xml:space="preserve">讀取 </w:t>
+      </w:r>
+      <w:r>
+        <w:rPr>
+          <w:rFonts w:ascii="Consolas" w:hAnsi="Consolas"/>
+          <w:color w:val="0E7490"/>
+          <w:sz w:val="19"/>
+        </w:rPr>
+        <w:t>data/sample_web3_posts.csv</w:t>
+      </w:r>
+      <w:r>
+        <w:t>。</w:t>
       </w:r>
     </w:p>
     <w:p>
@@ -105,12 +115,13 @@
     </w:p>
     <w:p>
       <w:pPr>
-        <w:spacing w:after="160"/>
-        <w:ind w:left="288"/>
+        <w:spacing w:before="80" w:after="160"/>
+        <w:shd w:fill="F3F6FA"/>
       </w:pPr>
       <w:r>
         <w:rPr>
-          <w:rFonts w:ascii="Consolas" w:hAnsi="Consolas" w:eastAsia="Consolas"/>
+          <w:rFonts w:ascii="Consolas" w:hAnsi="Consolas"/>
+          <w:color w:val="1E293B"/>
           <w:sz w:val="18"/>
         </w:rPr>
         <w:t>cd "C:\Users\haushuk\Desktop\資料科學實務\期末\web3_kg_project"</w:t>
@@ -123,12 +134,13 @@
     </w:p>
     <w:p>
       <w:pPr>
-        <w:spacing w:after="160"/>
-        <w:ind w:left="288"/>
+        <w:spacing w:before="80" w:after="160"/>
+        <w:shd w:fill="F3F6FA"/>
       </w:pPr>
       <w:r>
         <w:rPr>
-          <w:rFonts w:ascii="Consolas" w:hAnsi="Consolas" w:eastAsia="Consolas"/>
+          <w:rFonts w:ascii="Consolas" w:hAnsi="Consolas"/>
+          <w:color w:val="1E293B"/>
           <w:sz w:val="18"/>
         </w:rPr>
         <w:t>python --version</w:t>
@@ -141,12 +153,13 @@
     </w:p>
     <w:p>
       <w:pPr>
-        <w:spacing w:after="160"/>
-        <w:ind w:left="288"/>
+        <w:spacing w:before="80" w:after="160"/>
+        <w:shd w:fill="F3F6FA"/>
       </w:pPr>
       <w:r>
         <w:rPr>
-          <w:rFonts w:ascii="Consolas" w:hAnsi="Consolas" w:eastAsia="Consolas"/>
+          <w:rFonts w:ascii="Consolas" w:hAnsi="Consolas"/>
+          <w:color w:val="1E293B"/>
           <w:sz w:val="18"/>
         </w:rPr>
         <w:t>pip install -r requirements.txt</w:t>
@@ -166,7 +179,8 @@
       </w:r>
       <w:r>
         <w:rPr>
-          <w:rFonts w:ascii="Consolas" w:hAnsi="Consolas" w:eastAsia="Consolas"/>
+          <w:rFonts w:ascii="Consolas" w:hAnsi="Consolas"/>
+          <w:color w:val="0E7490"/>
           <w:sz w:val="19"/>
         </w:rPr>
         <w:t>web3_kg_project</w:t>
@@ -177,12 +191,13 @@
     </w:p>
     <w:p>
       <w:pPr>
-        <w:spacing w:after="160"/>
-        <w:ind w:left="288"/>
+        <w:spacing w:before="80" w:after="160"/>
+        <w:shd w:fill="F3F6FA"/>
       </w:pPr>
       <w:r>
         <w:rPr>
-          <w:rFonts w:ascii="Consolas" w:hAnsi="Consolas" w:eastAsia="Consolas"/>
+          <w:rFonts w:ascii="Consolas" w:hAnsi="Consolas"/>
+          <w:color w:val="1E293B"/>
           <w:sz w:val="18"/>
         </w:rPr>
         <w:t>python .\src\pipeline.py</w:t>
@@ -195,54 +210,23 @@
     </w:p>
     <w:p>
       <w:pPr>
-        <w:spacing w:after="160"/>
-        <w:ind w:left="288"/>
+        <w:spacing w:before="80" w:after="160"/>
+        <w:shd w:fill="F3F6FA"/>
       </w:pPr>
       <w:r>
         <w:rPr>
-          <w:rFonts w:ascii="Consolas" w:hAnsi="Consolas" w:eastAsia="Consolas"/>
+          <w:rFonts w:ascii="Consolas" w:hAnsi="Consolas"/>
+          <w:color w:val="1E293B"/>
           <w:sz w:val="18"/>
         </w:rPr>
         <w:t>Input posts: 15</w:t>
-      </w:r>
-      <w:r>
         <w:br/>
-      </w:r>
-      <w:r>
-        <w:rPr>
-          <w:rFonts w:ascii="Consolas" w:hAnsi="Consolas" w:eastAsia="Consolas"/>
-          <w:sz w:val="18"/>
-        </w:rPr>
         <w:t>Nodes: 74</w:t>
-      </w:r>
-      <w:r>
         <w:br/>
-      </w:r>
-      <w:r>
-        <w:rPr>
-          <w:rFonts w:ascii="Consolas" w:hAnsi="Consolas" w:eastAsia="Consolas"/>
-          <w:sz w:val="18"/>
-        </w:rPr>
         <w:t>Edges: 293</w:t>
-      </w:r>
-      <w:r>
         <w:br/>
-      </w:r>
-      <w:r>
-        <w:rPr>
-          <w:rFonts w:ascii="Consolas" w:hAnsi="Consolas" w:eastAsia="Consolas"/>
-          <w:sz w:val="18"/>
-        </w:rPr>
         <w:t>Community method: louvain</w:t>
-      </w:r>
-      <w:r>
         <w:br/>
-      </w:r>
-      <w:r>
-        <w:rPr>
-          <w:rFonts w:ascii="Consolas" w:hAnsi="Consolas" w:eastAsia="Consolas"/>
-          <w:sz w:val="18"/>
-        </w:rPr>
         <w:t>Outputs written to: ...\outputs</w:t>
       </w:r>
     </w:p>
@@ -260,7 +244,8 @@
       </w:r>
       <w:r>
         <w:rPr>
-          <w:rFonts w:ascii="Consolas" w:hAnsi="Consolas" w:eastAsia="Consolas"/>
+          <w:rFonts w:ascii="Consolas" w:hAnsi="Consolas"/>
+          <w:color w:val="0E7490"/>
           <w:sz w:val="19"/>
         </w:rPr>
         <w:t>web3_kg_project</w:t>
@@ -271,12 +256,13 @@
     </w:p>
     <w:p>
       <w:pPr>
-        <w:spacing w:after="160"/>
-        <w:ind w:left="288"/>
+        <w:spacing w:before="80" w:after="160"/>
+        <w:shd w:fill="F3F6FA"/>
       </w:pPr>
       <w:r>
         <w:rPr>
-          <w:rFonts w:ascii="Consolas" w:hAnsi="Consolas" w:eastAsia="Consolas"/>
+          <w:rFonts w:ascii="Consolas" w:hAnsi="Consolas"/>
+          <w:color w:val="1E293B"/>
           <w:sz w:val="18"/>
         </w:rPr>
         <w:t>python -m http.server 8080</w:t>
@@ -289,12 +275,13 @@
     </w:p>
     <w:p>
       <w:pPr>
-        <w:spacing w:after="160"/>
-        <w:ind w:left="288"/>
+        <w:spacing w:before="80" w:after="160"/>
+        <w:shd w:fill="F3F6FA"/>
       </w:pPr>
       <w:r>
         <w:rPr>
-          <w:rFonts w:ascii="Consolas" w:hAnsi="Consolas" w:eastAsia="Consolas"/>
+          <w:rFonts w:ascii="Consolas" w:hAnsi="Consolas"/>
+          <w:color w:val="1E293B"/>
           <w:sz w:val="18"/>
         </w:rPr>
         <w:t>Serving HTTP on :: port 8080 ...</w:t>
@@ -307,12 +294,13 @@
     </w:p>
     <w:p>
       <w:pPr>
-        <w:spacing w:after="160"/>
-        <w:ind w:left="288"/>
+        <w:spacing w:before="80" w:after="160"/>
+        <w:shd w:fill="F3F6FA"/>
       </w:pPr>
       <w:r>
         <w:rPr>
-          <w:rFonts w:ascii="Consolas" w:hAnsi="Consolas" w:eastAsia="Consolas"/>
+          <w:rFonts w:ascii="Consolas" w:hAnsi="Consolas"/>
+          <w:color w:val="1E293B"/>
           <w:sz w:val="18"/>
         </w:rPr>
         <w:t>http://localhost:8080/outputs/interactive_graph.html</w:t>
@@ -338,12 +326,13 @@
     </w:p>
     <w:p>
       <w:pPr>
-        <w:spacing w:after="160"/>
-        <w:ind w:left="288"/>
+        <w:spacing w:before="80" w:after="160"/>
+        <w:shd w:fill="F3F6FA"/>
       </w:pPr>
       <w:r>
         <w:rPr>
-          <w:rFonts w:ascii="Consolas" w:hAnsi="Consolas" w:eastAsia="Consolas"/>
+          <w:rFonts w:ascii="Consolas" w:hAnsi="Consolas"/>
+          <w:color w:val="1E293B"/>
           <w:sz w:val="18"/>
         </w:rPr>
         <w:t>Ctrl + C</w:t>
@@ -368,7 +357,8 @@
       </w:r>
       <w:r>
         <w:rPr>
-          <w:rFonts w:ascii="Consolas" w:hAnsi="Consolas" w:eastAsia="Consolas"/>
+          <w:rFonts w:ascii="Consolas" w:hAnsi="Consolas"/>
+          <w:color w:val="0E7490"/>
           <w:sz w:val="19"/>
         </w:rPr>
         <w:t>outputs/</w:t>
@@ -381,38 +371,23 @@
       <w:tblPr>
         <w:tblStyle w:val="TableGrid"/>
         <w:tblW w:type="auto" w:w="0"/>
-        <w:jc w:val="center"/>
+        <w:jc w:val="left"/>
         <w:tblLook w:firstColumn="1" w:firstRow="1" w:lastColumn="0" w:lastRow="0" w:noHBand="0" w:noVBand="1" w:val="04A0"/>
       </w:tblPr>
       <w:tblGrid>
-        <w:gridCol w:w="4968"/>
-        <w:gridCol w:w="4968"/>
+        <w:gridCol w:w="4824"/>
+        <w:gridCol w:w="4824"/>
       </w:tblGrid>
       <w:tr>
         <w:tc>
           <w:tcPr>
-            <w:tcW w:type="dxa" w:w="4968"/>
-            <w:vAlign w:val="center"/>
-            <w:shd w:fill="D9EAF7"/>
+            <w:tcW w:type="dxa" w:w="4824"/>
+            <w:shd w:fill="E8EEF6"/>
           </w:tcPr>
           <w:p>
-            <w:pPr>
-              <w:spacing w:after="0"/>
-            </w:pPr>
             <w:r>
               <w:rPr>
-                <w:rFonts w:ascii="Arial" w:hAnsi="Arial" w:eastAsia="Microsoft JhengHei"/>
                 <w:b/>
-                <w:color w:val="1F4E79"/>
-                <w:sz w:val="18"/>
-              </w:rPr>
-            </w:r>
-            <w:r>
-              <w:rPr>
-                <w:rFonts w:ascii="Arial" w:hAnsi="Arial" w:eastAsia="Microsoft JhengHei"/>
-                <w:b/>
-                <w:color w:val="1F4E79"/>
-                <w:sz w:val="18"/>
               </w:rPr>
               <w:t>檔案</w:t>
             </w:r>
@@ -420,28 +395,13 @@
         </w:tc>
         <w:tc>
           <w:tcPr>
-            <w:tcW w:type="dxa" w:w="4968"/>
-            <w:vAlign w:val="center"/>
-            <w:shd w:fill="D9EAF7"/>
+            <w:tcW w:type="dxa" w:w="4824"/>
+            <w:shd w:fill="E8EEF6"/>
           </w:tcPr>
           <w:p>
-            <w:pPr>
-              <w:spacing w:after="0"/>
-            </w:pPr>
             <w:r>
               <w:rPr>
-                <w:rFonts w:ascii="Arial" w:hAnsi="Arial" w:eastAsia="Microsoft JhengHei"/>
                 <w:b/>
-                <w:color w:val="1F4E79"/>
-                <w:sz w:val="18"/>
-              </w:rPr>
-            </w:r>
-            <w:r>
-              <w:rPr>
-                <w:rFonts w:ascii="Arial" w:hAnsi="Arial" w:eastAsia="Microsoft JhengHei"/>
-                <w:b/>
-                <w:color w:val="1F4E79"/>
-                <w:sz w:val="18"/>
               </w:rPr>
               <w:t>說明</w:t>
             </w:r>
@@ -451,50 +411,22 @@
       <w:tr>
         <w:tc>
           <w:tcPr>
-            <w:tcW w:type="dxa" w:w="4968"/>
+            <w:tcW w:type="dxa" w:w="4824"/>
             <w:vAlign w:val="center"/>
           </w:tcPr>
           <w:p>
-            <w:pPr>
-              <w:spacing w:after="0"/>
-            </w:pPr>
             <w:r>
-              <w:rPr>
-                <w:rFonts w:ascii="Arial" w:hAnsi="Arial" w:eastAsia="Microsoft JhengHei"/>
-                <w:sz w:val="18"/>
-              </w:rPr>
-            </w:r>
-            <w:r>
-              <w:rPr>
-                <w:rFonts w:ascii="Arial" w:hAnsi="Arial" w:eastAsia="Microsoft JhengHei"/>
-                <w:b w:val="0"/>
-                <w:sz w:val="18"/>
-              </w:rPr>
-              <w:t>interactive_graph.html</w:t>
+              <w:t>`interactive_graph.html`</w:t>
             </w:r>
           </w:p>
         </w:tc>
         <w:tc>
           <w:tcPr>
-            <w:tcW w:type="dxa" w:w="4968"/>
+            <w:tcW w:type="dxa" w:w="4824"/>
             <w:vAlign w:val="center"/>
           </w:tcPr>
           <w:p>
-            <w:pPr>
-              <w:spacing w:after="0"/>
-            </w:pPr>
             <w:r>
-              <w:rPr>
-                <w:rFonts w:ascii="Arial" w:hAnsi="Arial" w:eastAsia="Microsoft JhengHei"/>
-                <w:sz w:val="18"/>
-              </w:rPr>
-            </w:r>
-            <w:r>
-              <w:rPr>
-                <w:rFonts w:ascii="Arial" w:hAnsi="Arial" w:eastAsia="Microsoft JhengHei"/>
-                <w:b w:val="0"/>
-                <w:sz w:val="18"/>
-              </w:rPr>
               <w:t>可用瀏覽器打開的互動圖譜</w:t>
             </w:r>
           </w:p>
@@ -503,50 +435,22 @@
       <w:tr>
         <w:tc>
           <w:tcPr>
-            <w:tcW w:type="dxa" w:w="4968"/>
+            <w:tcW w:type="dxa" w:w="4824"/>
             <w:vAlign w:val="center"/>
           </w:tcPr>
           <w:p>
-            <w:pPr>
-              <w:spacing w:after="0"/>
-            </w:pPr>
             <w:r>
-              <w:rPr>
-                <w:rFonts w:ascii="Arial" w:hAnsi="Arial" w:eastAsia="Microsoft JhengHei"/>
-                <w:sz w:val="18"/>
-              </w:rPr>
-            </w:r>
-            <w:r>
-              <w:rPr>
-                <w:rFonts w:ascii="Arial" w:hAnsi="Arial" w:eastAsia="Microsoft JhengHei"/>
-                <w:b w:val="0"/>
-                <w:sz w:val="18"/>
-              </w:rPr>
-              <w:t>analysis_summary.md</w:t>
+              <w:t>`analysis_summary.md`</w:t>
             </w:r>
           </w:p>
         </w:tc>
         <w:tc>
           <w:tcPr>
-            <w:tcW w:type="dxa" w:w="4968"/>
+            <w:tcW w:type="dxa" w:w="4824"/>
             <w:vAlign w:val="center"/>
           </w:tcPr>
           <w:p>
-            <w:pPr>
-              <w:spacing w:after="0"/>
-            </w:pPr>
             <w:r>
-              <w:rPr>
-                <w:rFonts w:ascii="Arial" w:hAnsi="Arial" w:eastAsia="Microsoft JhengHei"/>
-                <w:sz w:val="18"/>
-              </w:rPr>
-            </w:r>
-            <w:r>
-              <w:rPr>
-                <w:rFonts w:ascii="Arial" w:hAnsi="Arial" w:eastAsia="Microsoft JhengHei"/>
-                <w:b w:val="0"/>
-                <w:sz w:val="18"/>
-              </w:rPr>
               <w:t>分析摘要與 Top Entities</w:t>
             </w:r>
           </w:p>
@@ -555,50 +459,22 @@
       <w:tr>
         <w:tc>
           <w:tcPr>
-            <w:tcW w:type="dxa" w:w="4968"/>
+            <w:tcW w:type="dxa" w:w="4824"/>
             <w:vAlign w:val="center"/>
           </w:tcPr>
           <w:p>
-            <w:pPr>
-              <w:spacing w:after="0"/>
-            </w:pPr>
             <w:r>
-              <w:rPr>
-                <w:rFonts w:ascii="Arial" w:hAnsi="Arial" w:eastAsia="Microsoft JhengHei"/>
-                <w:sz w:val="18"/>
-              </w:rPr>
-            </w:r>
-            <w:r>
-              <w:rPr>
-                <w:rFonts w:ascii="Arial" w:hAnsi="Arial" w:eastAsia="Microsoft JhengHei"/>
-                <w:b w:val="0"/>
-                <w:sz w:val="18"/>
-              </w:rPr>
-              <w:t>nodes.csv</w:t>
+              <w:t>`nodes.csv`</w:t>
             </w:r>
           </w:p>
         </w:tc>
         <w:tc>
           <w:tcPr>
-            <w:tcW w:type="dxa" w:w="4968"/>
+            <w:tcW w:type="dxa" w:w="4824"/>
             <w:vAlign w:val="center"/>
           </w:tcPr>
           <w:p>
-            <w:pPr>
-              <w:spacing w:after="0"/>
-            </w:pPr>
             <w:r>
-              <w:rPr>
-                <w:rFonts w:ascii="Arial" w:hAnsi="Arial" w:eastAsia="Microsoft JhengHei"/>
-                <w:sz w:val="18"/>
-              </w:rPr>
-            </w:r>
-            <w:r>
-              <w:rPr>
-                <w:rFonts w:ascii="Arial" w:hAnsi="Arial" w:eastAsia="Microsoft JhengHei"/>
-                <w:b w:val="0"/>
-                <w:sz w:val="18"/>
-              </w:rPr>
               <w:t>圖譜節點表</w:t>
             </w:r>
           </w:p>
@@ -607,50 +483,22 @@
       <w:tr>
         <w:tc>
           <w:tcPr>
-            <w:tcW w:type="dxa" w:w="4968"/>
+            <w:tcW w:type="dxa" w:w="4824"/>
             <w:vAlign w:val="center"/>
           </w:tcPr>
           <w:p>
-            <w:pPr>
-              <w:spacing w:after="0"/>
-            </w:pPr>
             <w:r>
-              <w:rPr>
-                <w:rFonts w:ascii="Arial" w:hAnsi="Arial" w:eastAsia="Microsoft JhengHei"/>
-                <w:sz w:val="18"/>
-              </w:rPr>
-            </w:r>
-            <w:r>
-              <w:rPr>
-                <w:rFonts w:ascii="Arial" w:hAnsi="Arial" w:eastAsia="Microsoft JhengHei"/>
-                <w:b w:val="0"/>
-                <w:sz w:val="18"/>
-              </w:rPr>
-              <w:t>edges.csv</w:t>
+              <w:t>`edges.csv`</w:t>
             </w:r>
           </w:p>
         </w:tc>
         <w:tc>
           <w:tcPr>
-            <w:tcW w:type="dxa" w:w="4968"/>
+            <w:tcW w:type="dxa" w:w="4824"/>
             <w:vAlign w:val="center"/>
           </w:tcPr>
           <w:p>
-            <w:pPr>
-              <w:spacing w:after="0"/>
-            </w:pPr>
             <w:r>
-              <w:rPr>
-                <w:rFonts w:ascii="Arial" w:hAnsi="Arial" w:eastAsia="Microsoft JhengHei"/>
-                <w:sz w:val="18"/>
-              </w:rPr>
-            </w:r>
-            <w:r>
-              <w:rPr>
-                <w:rFonts w:ascii="Arial" w:hAnsi="Arial" w:eastAsia="Microsoft JhengHei"/>
-                <w:b w:val="0"/>
-                <w:sz w:val="18"/>
-              </w:rPr>
               <w:t>圖譜關係表</w:t>
             </w:r>
           </w:p>
@@ -659,50 +507,22 @@
       <w:tr>
         <w:tc>
           <w:tcPr>
-            <w:tcW w:type="dxa" w:w="4968"/>
+            <w:tcW w:type="dxa" w:w="4824"/>
             <w:vAlign w:val="center"/>
           </w:tcPr>
           <w:p>
-            <w:pPr>
-              <w:spacing w:after="0"/>
-            </w:pPr>
             <w:r>
-              <w:rPr>
-                <w:rFonts w:ascii="Arial" w:hAnsi="Arial" w:eastAsia="Microsoft JhengHei"/>
-                <w:sz w:val="18"/>
-              </w:rPr>
-            </w:r>
-            <w:r>
-              <w:rPr>
-                <w:rFonts w:ascii="Arial" w:hAnsi="Arial" w:eastAsia="Microsoft JhengHei"/>
-                <w:b w:val="0"/>
-                <w:sz w:val="18"/>
-              </w:rPr>
-              <w:t>graph.json</w:t>
+              <w:t>`graph.json`</w:t>
             </w:r>
           </w:p>
         </w:tc>
         <w:tc>
           <w:tcPr>
-            <w:tcW w:type="dxa" w:w="4968"/>
+            <w:tcW w:type="dxa" w:w="4824"/>
             <w:vAlign w:val="center"/>
           </w:tcPr>
           <w:p>
-            <w:pPr>
-              <w:spacing w:after="0"/>
-            </w:pPr>
             <w:r>
-              <w:rPr>
-                <w:rFonts w:ascii="Arial" w:hAnsi="Arial" w:eastAsia="Microsoft JhengHei"/>
-                <w:sz w:val="18"/>
-              </w:rPr>
-            </w:r>
-            <w:r>
-              <w:rPr>
-                <w:rFonts w:ascii="Arial" w:hAnsi="Arial" w:eastAsia="Microsoft JhengHei"/>
-                <w:b w:val="0"/>
-                <w:sz w:val="18"/>
-              </w:rPr>
               <w:t>完整圖譜 JSON</w:t>
             </w:r>
           </w:p>
@@ -711,50 +531,22 @@
       <w:tr>
         <w:tc>
           <w:tcPr>
-            <w:tcW w:type="dxa" w:w="4968"/>
+            <w:tcW w:type="dxa" w:w="4824"/>
             <w:vAlign w:val="center"/>
           </w:tcPr>
           <w:p>
-            <w:pPr>
-              <w:spacing w:after="0"/>
-            </w:pPr>
             <w:r>
-              <w:rPr>
-                <w:rFonts w:ascii="Arial" w:hAnsi="Arial" w:eastAsia="Microsoft JhengHei"/>
-                <w:sz w:val="18"/>
-              </w:rPr>
-            </w:r>
-            <w:r>
-              <w:rPr>
-                <w:rFonts w:ascii="Arial" w:hAnsi="Arial" w:eastAsia="Microsoft JhengHei"/>
-                <w:b w:val="0"/>
-                <w:sz w:val="18"/>
-              </w:rPr>
-              <w:t>neo4j_import.cypher</w:t>
+              <w:t>`neo4j_import.cypher`</w:t>
             </w:r>
           </w:p>
         </w:tc>
         <w:tc>
           <w:tcPr>
-            <w:tcW w:type="dxa" w:w="4968"/>
+            <w:tcW w:type="dxa" w:w="4824"/>
             <w:vAlign w:val="center"/>
           </w:tcPr>
           <w:p>
-            <w:pPr>
-              <w:spacing w:after="0"/>
-            </w:pPr>
             <w:r>
-              <w:rPr>
-                <w:rFonts w:ascii="Arial" w:hAnsi="Arial" w:eastAsia="Microsoft JhengHei"/>
-                <w:sz w:val="18"/>
-              </w:rPr>
-            </w:r>
-            <w:r>
-              <w:rPr>
-                <w:rFonts w:ascii="Arial" w:hAnsi="Arial" w:eastAsia="Microsoft JhengHei"/>
-                <w:b w:val="0"/>
-                <w:sz w:val="18"/>
-              </w:rPr>
               <w:t>可匯入 Neo4j 的 Cypher 腳本</w:t>
             </w:r>
           </w:p>
@@ -801,7 +593,15 @@
         <w:pStyle w:val="ListBullet"/>
       </w:pPr>
       <w:r>
-        <w:t>MENTIONS：文章提到某個實體。</w:t>
+        <w:rPr>
+          <w:rFonts w:ascii="Consolas" w:hAnsi="Consolas"/>
+          <w:color w:val="0E7490"/>
+          <w:sz w:val="19"/>
+        </w:rPr>
+        <w:t>MENTIONS</w:t>
+      </w:r>
+      <w:r>
+        <w:t>：文章提到某個實體。</w:t>
       </w:r>
     </w:p>
     <w:p>
@@ -809,7 +609,15 @@
         <w:pStyle w:val="ListBullet"/>
       </w:pPr>
       <w:r>
-        <w:t>CO_MENTIONED_WITH：兩個實體在同一篇文章中共同出現。</w:t>
+        <w:rPr>
+          <w:rFonts w:ascii="Consolas" w:hAnsi="Consolas"/>
+          <w:color w:val="0E7490"/>
+          <w:sz w:val="19"/>
+        </w:rPr>
+        <w:t>CO_MENTIONED_WITH</w:t>
+      </w:r>
+      <w:r>
+        <w:t>：兩個實體在同一篇文章中共同出現。</w:t>
       </w:r>
     </w:p>
     <w:p>
@@ -817,7 +625,15 @@
         <w:pStyle w:val="ListBullet"/>
       </w:pPr>
       <w:r>
-        <w:t>BELONGS_TO：實體屬於某個主題。</w:t>
+        <w:rPr>
+          <w:rFonts w:ascii="Consolas" w:hAnsi="Consolas"/>
+          <w:color w:val="0E7490"/>
+          <w:sz w:val="19"/>
+        </w:rPr>
+        <w:t>BELONGS_TO</w:t>
+      </w:r>
+      <w:r>
+        <w:t>：實體屬於某個主題。</w:t>
       </w:r>
     </w:p>
     <w:p>
@@ -883,7 +699,18 @@
         <w:pStyle w:val="ListNumber"/>
       </w:pPr>
       <w:r>
-        <w:t>打開 outputs/neo4j_import.cypher。</w:t>
+        <w:t xml:space="preserve">打開 </w:t>
+      </w:r>
+      <w:r>
+        <w:rPr>
+          <w:rFonts w:ascii="Consolas" w:hAnsi="Consolas"/>
+          <w:color w:val="0E7490"/>
+          <w:sz w:val="19"/>
+        </w:rPr>
+        <w:t>outputs/neo4j_import.cypher</w:t>
+      </w:r>
+      <w:r>
+        <w:t>。</w:t>
       </w:r>
     </w:p>
     <w:p>
@@ -909,34 +736,19 @@
     </w:p>
     <w:p>
       <w:pPr>
-        <w:spacing w:after="160"/>
-        <w:ind w:left="288"/>
+        <w:spacing w:before="80" w:after="160"/>
+        <w:shd w:fill="F3F6FA"/>
       </w:pPr>
       <w:r>
         <w:rPr>
-          <w:rFonts w:ascii="Consolas" w:hAnsi="Consolas" w:eastAsia="Consolas"/>
+          <w:rFonts w:ascii="Consolas" w:hAnsi="Consolas"/>
+          <w:color w:val="1E293B"/>
           <w:sz w:val="18"/>
         </w:rPr>
         <w:t>MATCH (n:KGNode)</w:t>
-      </w:r>
-      <w:r>
         <w:br/>
-      </w:r>
-      <w:r>
-        <w:rPr>
-          <w:rFonts w:ascii="Consolas" w:hAnsi="Consolas" w:eastAsia="Consolas"/>
-          <w:sz w:val="18"/>
-        </w:rPr>
         <w:t>RETURN labels(n), n.name, n.entity_type</w:t>
-      </w:r>
-      <w:r>
         <w:br/>
-      </w:r>
-      <w:r>
-        <w:rPr>
-          <w:rFonts w:ascii="Consolas" w:hAnsi="Consolas" w:eastAsia="Consolas"/>
-          <w:sz w:val="18"/>
-        </w:rPr>
         <w:t>LIMIT 25;</w:t>
       </w:r>
     </w:p>
@@ -947,44 +759,21 @@
     </w:p>
     <w:p>
       <w:pPr>
-        <w:spacing w:after="160"/>
-        <w:ind w:left="288"/>
+        <w:spacing w:before="80" w:after="160"/>
+        <w:shd w:fill="F3F6FA"/>
       </w:pPr>
       <w:r>
         <w:rPr>
-          <w:rFonts w:ascii="Consolas" w:hAnsi="Consolas" w:eastAsia="Consolas"/>
+          <w:rFonts w:ascii="Consolas" w:hAnsi="Consolas"/>
+          <w:color w:val="1E293B"/>
           <w:sz w:val="18"/>
         </w:rPr>
         <w:t>MATCH (a:Entity)-[r:CO_MENTIONED_WITH]-&gt;(b:Entity)</w:t>
-      </w:r>
-      <w:r>
         <w:br/>
-      </w:r>
-      <w:r>
-        <w:rPr>
-          <w:rFonts w:ascii="Consolas" w:hAnsi="Consolas" w:eastAsia="Consolas"/>
-          <w:sz w:val="18"/>
-        </w:rPr>
         <w:t>RETURN a.name AS source, b.name AS target, r.weight AS weight</w:t>
-      </w:r>
-      <w:r>
         <w:br/>
-      </w:r>
-      <w:r>
-        <w:rPr>
-          <w:rFonts w:ascii="Consolas" w:hAnsi="Consolas" w:eastAsia="Consolas"/>
-          <w:sz w:val="18"/>
-        </w:rPr>
         <w:t>ORDER BY weight DESC</w:t>
-      </w:r>
-      <w:r>
         <w:br/>
-      </w:r>
-      <w:r>
-        <w:rPr>
-          <w:rFonts w:ascii="Consolas" w:hAnsi="Consolas" w:eastAsia="Consolas"/>
-          <w:sz w:val="18"/>
-        </w:rPr>
         <w:t>LIMIT 10;</w:t>
       </w:r>
     </w:p>
@@ -995,34 +784,19 @@
     </w:p>
     <w:p>
       <w:pPr>
-        <w:spacing w:after="160"/>
-        <w:ind w:left="288"/>
+        <w:spacing w:before="80" w:after="160"/>
+        <w:shd w:fill="F3F6FA"/>
       </w:pPr>
       <w:r>
         <w:rPr>
-          <w:rFonts w:ascii="Consolas" w:hAnsi="Consolas" w:eastAsia="Consolas"/>
+          <w:rFonts w:ascii="Consolas" w:hAnsi="Consolas"/>
+          <w:color w:val="1E293B"/>
           <w:sz w:val="18"/>
         </w:rPr>
         <w:t>MATCH (e:Entity)-[:BELONGS_TO]-&gt;(t:Topic {name: "DeFi"})</w:t>
-      </w:r>
-      <w:r>
         <w:br/>
-      </w:r>
-      <w:r>
-        <w:rPr>
-          <w:rFonts w:ascii="Consolas" w:hAnsi="Consolas" w:eastAsia="Consolas"/>
-          <w:sz w:val="18"/>
-        </w:rPr>
         <w:t>RETURN e.name, e.entity_type, e.community</w:t>
-      </w:r>
-      <w:r>
         <w:br/>
-      </w:r>
-      <w:r>
-        <w:rPr>
-          <w:rFonts w:ascii="Consolas" w:hAnsi="Consolas" w:eastAsia="Consolas"/>
-          <w:sz w:val="18"/>
-        </w:rPr>
         <w:t>ORDER BY e.name;</w:t>
       </w:r>
     </w:p>
@@ -1041,12 +815,13 @@
     </w:p>
     <w:p>
       <w:pPr>
-        <w:spacing w:after="160"/>
-        <w:ind w:left="288"/>
+        <w:spacing w:before="80" w:after="160"/>
+        <w:shd w:fill="F3F6FA"/>
       </w:pPr>
       <w:r>
         <w:rPr>
-          <w:rFonts w:ascii="Consolas" w:hAnsi="Consolas" w:eastAsia="Consolas"/>
+          <w:rFonts w:ascii="Consolas" w:hAnsi="Consolas"/>
+          <w:color w:val="1E293B"/>
           <w:sz w:val="18"/>
         </w:rPr>
         <w:t>post_id, subreddit, title, selftext, created_utc, score, url</w:t>
@@ -1058,7 +833,8 @@
       </w:r>
       <w:r>
         <w:rPr>
-          <w:rFonts w:ascii="Consolas" w:hAnsi="Consolas" w:eastAsia="Consolas"/>
+          <w:rFonts w:ascii="Consolas" w:hAnsi="Consolas"/>
+          <w:color w:val="0E7490"/>
           <w:sz w:val="19"/>
         </w:rPr>
         <w:t>data/your_web3_posts.csv</w:t>
@@ -1069,12 +845,13 @@
     </w:p>
     <w:p>
       <w:pPr>
-        <w:spacing w:after="160"/>
-        <w:ind w:left="288"/>
+        <w:spacing w:before="80" w:after="160"/>
+        <w:shd w:fill="F3F6FA"/>
       </w:pPr>
       <w:r>
         <w:rPr>
-          <w:rFonts w:ascii="Consolas" w:hAnsi="Consolas" w:eastAsia="Consolas"/>
+          <w:rFonts w:ascii="Consolas" w:hAnsi="Consolas"/>
+          <w:color w:val="1E293B"/>
           <w:sz w:val="18"/>
         </w:rPr>
         <w:t>python .\src\pipeline.py --input .\data\your_web3_posts.csv --output .\outputs</w:t>
@@ -1100,20 +877,40 @@
     </w:p>
     <w:p>
       <w:r>
-        <w:t>執行：</w:t>
+        <w:t>如果只想抓貼文，執行：</w:t>
       </w:r>
     </w:p>
     <w:p>
       <w:pPr>
-        <w:spacing w:after="160"/>
-        <w:ind w:left="288"/>
+        <w:spacing w:before="80" w:after="160"/>
+        <w:shd w:fill="F3F6FA"/>
       </w:pPr>
       <w:r>
         <w:rPr>
-          <w:rFonts w:ascii="Consolas" w:hAnsi="Consolas" w:eastAsia="Consolas"/>
+          <w:rFonts w:ascii="Consolas" w:hAnsi="Consolas"/>
+          <w:color w:val="1E293B"/>
           <w:sz w:val="18"/>
         </w:rPr>
         <w:t>python .\src\reddit_crawler.py --subreddits ethereum defi CryptoCurrency solana web3 NFT --posts-per-subreddit 15 --output .\data\reddit_web3_posts.csv</w:t>
+      </w:r>
+    </w:p>
+    <w:p>
+      <w:r>
+        <w:t>如果想同時抓貼文與留言，執行：</w:t>
+      </w:r>
+    </w:p>
+    <w:p>
+      <w:pPr>
+        <w:spacing w:before="80" w:after="160"/>
+        <w:shd w:fill="F3F6FA"/>
+      </w:pPr>
+      <w:r>
+        <w:rPr>
+          <w:rFonts w:ascii="Consolas" w:hAnsi="Consolas"/>
+          <w:color w:val="1E293B"/>
+          <w:sz w:val="18"/>
+        </w:rPr>
+        <w:t>python .\src\reddit_crawler.py --subreddits ethereum defi CryptoCurrency solana web3 NFT --posts-per-subreddit 10 --comments-per-post 3 --comment-depth 2 --output .\data\reddit_web3_posts.csv</w:t>
       </w:r>
     </w:p>
     <w:p>
@@ -1123,12 +920,13 @@
     </w:p>
     <w:p>
       <w:pPr>
-        <w:spacing w:after="160"/>
-        <w:ind w:left="288"/>
+        <w:spacing w:before="80" w:after="160"/>
+        <w:shd w:fill="F3F6FA"/>
       </w:pPr>
       <w:r>
         <w:rPr>
-          <w:rFonts w:ascii="Consolas" w:hAnsi="Consolas" w:eastAsia="Consolas"/>
+          <w:rFonts w:ascii="Consolas" w:hAnsi="Consolas"/>
+          <w:color w:val="1E293B"/>
           <w:sz w:val="18"/>
         </w:rPr>
         <w:t>python .\src\pipeline.py --input .\data\reddit_web3_posts.csv --output .\outputs\reddit_live</w:t>
@@ -1141,12 +939,13 @@
     </w:p>
     <w:p>
       <w:pPr>
-        <w:spacing w:after="160"/>
-        <w:ind w:left="288"/>
+        <w:spacing w:before="80" w:after="160"/>
+        <w:shd w:fill="F3F6FA"/>
       </w:pPr>
       <w:r>
         <w:rPr>
-          <w:rFonts w:ascii="Consolas" w:hAnsi="Consolas" w:eastAsia="Consolas"/>
+          <w:rFonts w:ascii="Consolas" w:hAnsi="Consolas"/>
+          <w:color w:val="1E293B"/>
           <w:sz w:val="18"/>
         </w:rPr>
         <w:t>http://localhost:8080/outputs/reddit_live/interactive_graph.html</w:t>
@@ -1159,15 +958,109 @@
     </w:p>
     <w:p>
       <w:pPr>
-        <w:spacing w:after="160"/>
-        <w:ind w:left="288"/>
+        <w:spacing w:before="80" w:after="160"/>
+        <w:shd w:fill="F3F6FA"/>
       </w:pPr>
       <w:r>
         <w:rPr>
-          <w:rFonts w:ascii="Consolas" w:hAnsi="Consolas" w:eastAsia="Consolas"/>
+          <w:rFonts w:ascii="Consolas" w:hAnsi="Consolas"/>
+          <w:color w:val="1E293B"/>
           <w:sz w:val="18"/>
         </w:rPr>
         <w:t>docs/Reddit_Web3_Crawler_Tutorial.ipynb</w:t>
+      </w:r>
+    </w:p>
+    <w:p>
+      <w:r>
+        <w:t xml:space="preserve">爬蟲輸出的 CSV 會包含 </w:t>
+      </w:r>
+      <w:r>
+        <w:rPr>
+          <w:rFonts w:ascii="Consolas" w:hAnsi="Consolas"/>
+          <w:color w:val="0E7490"/>
+          <w:sz w:val="19"/>
+        </w:rPr>
+        <w:t>content_type</w:t>
+      </w:r>
+      <w:r>
+        <w:t xml:space="preserve"> 欄位：</w:t>
+      </w:r>
+    </w:p>
+    <w:p>
+      <w:pPr>
+        <w:pStyle w:val="ListBullet"/>
+      </w:pPr>
+      <w:r>
+        <w:rPr>
+          <w:rFonts w:ascii="Consolas" w:hAnsi="Consolas"/>
+          <w:color w:val="0E7490"/>
+          <w:sz w:val="19"/>
+        </w:rPr>
+        <w:t>post</w:t>
+      </w:r>
+      <w:r>
+        <w:t xml:space="preserve"> 代表 Reddit 貼文。</w:t>
+      </w:r>
+    </w:p>
+    <w:p>
+      <w:pPr>
+        <w:pStyle w:val="ListBullet"/>
+      </w:pPr>
+      <w:r>
+        <w:rPr>
+          <w:rFonts w:ascii="Consolas" w:hAnsi="Consolas"/>
+          <w:color w:val="0E7490"/>
+          <w:sz w:val="19"/>
+        </w:rPr>
+        <w:t>comment</w:t>
+      </w:r>
+      <w:r>
+        <w:t xml:space="preserve"> 代表該貼文底下的留言。</w:t>
+      </w:r>
+    </w:p>
+    <w:p>
+      <w:r>
+        <w:t xml:space="preserve">留言列會保留 </w:t>
+      </w:r>
+      <w:r>
+        <w:rPr>
+          <w:rFonts w:ascii="Consolas" w:hAnsi="Consolas"/>
+          <w:color w:val="0E7490"/>
+          <w:sz w:val="19"/>
+        </w:rPr>
+        <w:t>parent_post_id</w:t>
+      </w:r>
+      <w:r>
+        <w:t>，方便知道它來自哪一篇貼文。Pipeline 會自動把</w:t>
+      </w:r>
+    </w:p>
+    <w:p>
+      <w:r>
+        <w:rPr>
+          <w:rFonts w:ascii="Consolas" w:hAnsi="Consolas"/>
+          <w:color w:val="0E7490"/>
+          <w:sz w:val="19"/>
+        </w:rPr>
+        <w:t>post</w:t>
+      </w:r>
+      <w:r>
+        <w:t xml:space="preserve"> 轉成 Post 節點，把 </w:t>
+      </w:r>
+      <w:r>
+        <w:rPr>
+          <w:rFonts w:ascii="Consolas" w:hAnsi="Consolas"/>
+          <w:color w:val="0E7490"/>
+          <w:sz w:val="19"/>
+        </w:rPr>
+        <w:t>comment</w:t>
+      </w:r>
+      <w:r>
+        <w:t xml:space="preserve"> 轉成 Comment 節點，兩者都會參與 Web3</w:t>
+      </w:r>
+    </w:p>
+    <w:p>
+      <w:r>
+        <w:t>entity 與 topic 分析。</w:t>
       </w:r>
     </w:p>
     <w:p>
@@ -1193,12 +1086,13 @@
     </w:p>
     <w:p>
       <w:pPr>
-        <w:spacing w:after="160"/>
-        <w:ind w:left="288"/>
+        <w:spacing w:before="80" w:after="160"/>
+        <w:shd w:fill="F3F6FA"/>
       </w:pPr>
       <w:r>
         <w:rPr>
-          <w:rFonts w:ascii="Consolas" w:hAnsi="Consolas" w:eastAsia="Consolas"/>
+          <w:rFonts w:ascii="Consolas" w:hAnsi="Consolas"/>
+          <w:color w:val="1E293B"/>
           <w:sz w:val="18"/>
         </w:rPr>
         <w:t>ModuleNotFoundError: No module named 'pandas'</w:t>
@@ -1211,12 +1105,13 @@
     </w:p>
     <w:p>
       <w:pPr>
-        <w:spacing w:after="160"/>
-        <w:ind w:left="288"/>
+        <w:spacing w:before="80" w:after="160"/>
+        <w:shd w:fill="F3F6FA"/>
       </w:pPr>
       <w:r>
         <w:rPr>
-          <w:rFonts w:ascii="Consolas" w:hAnsi="Consolas" w:eastAsia="Consolas"/>
+          <w:rFonts w:ascii="Consolas" w:hAnsi="Consolas"/>
+          <w:color w:val="1E293B"/>
           <w:sz w:val="18"/>
         </w:rPr>
         <w:t>pip install -r requirements.txt</w:t>
@@ -1237,12 +1132,13 @@
     </w:p>
     <w:p>
       <w:pPr>
-        <w:spacing w:after="160"/>
-        <w:ind w:left="288"/>
+        <w:spacing w:before="80" w:after="160"/>
+        <w:shd w:fill="F3F6FA"/>
       </w:pPr>
       <w:r>
         <w:rPr>
-          <w:rFonts w:ascii="Consolas" w:hAnsi="Consolas" w:eastAsia="Consolas"/>
+          <w:rFonts w:ascii="Consolas" w:hAnsi="Consolas"/>
+          <w:color w:val="1E293B"/>
           <w:sz w:val="18"/>
         </w:rPr>
         <w:t>python -m http.server 8090</w:t>
@@ -1255,12 +1151,13 @@
     </w:p>
     <w:p>
       <w:pPr>
-        <w:spacing w:after="160"/>
-        <w:ind w:left="288"/>
+        <w:spacing w:before="80" w:after="160"/>
+        <w:shd w:fill="F3F6FA"/>
       </w:pPr>
       <w:r>
         <w:rPr>
-          <w:rFonts w:ascii="Consolas" w:hAnsi="Consolas" w:eastAsia="Consolas"/>
+          <w:rFonts w:ascii="Consolas" w:hAnsi="Consolas"/>
+          <w:color w:val="1E293B"/>
           <w:sz w:val="18"/>
         </w:rPr>
         <w:t>http://localhost:8090/outputs/interactive_graph.html</w:t>
@@ -1281,12 +1178,13 @@
     </w:p>
     <w:p>
       <w:pPr>
-        <w:spacing w:after="160"/>
-        <w:ind w:left="288"/>
+        <w:spacing w:before="80" w:after="160"/>
+        <w:shd w:fill="F3F6FA"/>
       </w:pPr>
       <w:r>
         <w:rPr>
-          <w:rFonts w:ascii="Consolas" w:hAnsi="Consolas" w:eastAsia="Consolas"/>
+          <w:rFonts w:ascii="Consolas" w:hAnsi="Consolas"/>
+          <w:color w:val="1E293B"/>
           <w:sz w:val="18"/>
         </w:rPr>
         <w:t>post_id, subreddit, title, selftext, created_utc, score, url</w:t>
@@ -1307,15 +1205,16 @@
     </w:p>
     <w:p>
       <w:pPr>
-        <w:spacing w:after="160"/>
-        <w:ind w:left="288"/>
+        <w:spacing w:before="80" w:after="160"/>
+        <w:shd w:fill="F3F6FA"/>
       </w:pPr>
       <w:r>
         <w:rPr>
-          <w:rFonts w:ascii="Consolas" w:hAnsi="Consolas" w:eastAsia="Consolas"/>
+          <w:rFonts w:ascii="Consolas" w:hAnsi="Consolas"/>
+          <w:color w:val="1E293B"/>
           <w:sz w:val="18"/>
         </w:rPr>
-        <w:t>python .\src\reddit_crawler.py --sleep-seconds 3 --posts-per-subreddit 8</w:t>
+        <w:t>python .\src\reddit_crawler.py --sleep-seconds 3 --posts-per-subreddit 8 --comments-per-post 1</w:t>
       </w:r>
     </w:p>
     <w:p>
@@ -1344,7 +1243,18 @@
         <w:pStyle w:val="ListNumber"/>
       </w:pPr>
       <w:r>
-        <w:t>展示 sample_web3_posts.csv。</w:t>
+        <w:t xml:space="preserve">展示 </w:t>
+      </w:r>
+      <w:r>
+        <w:rPr>
+          <w:rFonts w:ascii="Consolas" w:hAnsi="Consolas"/>
+          <w:color w:val="0E7490"/>
+          <w:sz w:val="19"/>
+        </w:rPr>
+        <w:t>sample_web3_posts.csv</w:t>
+      </w:r>
+      <w:r>
+        <w:t>。</w:t>
       </w:r>
     </w:p>
     <w:p>
@@ -1352,7 +1262,18 @@
         <w:pStyle w:val="ListNumber"/>
       </w:pPr>
       <w:r>
-        <w:t>執行 python .\src\pipeline.py。</w:t>
+        <w:t xml:space="preserve">執行 </w:t>
+      </w:r>
+      <w:r>
+        <w:rPr>
+          <w:rFonts w:ascii="Consolas" w:hAnsi="Consolas"/>
+          <w:color w:val="0E7490"/>
+          <w:sz w:val="19"/>
+        </w:rPr>
+        <w:t>python .\src\pipeline.py</w:t>
+      </w:r>
+      <w:r>
+        <w:t>。</w:t>
       </w:r>
     </w:p>
     <w:p>
@@ -1360,7 +1281,18 @@
         <w:pStyle w:val="ListNumber"/>
       </w:pPr>
       <w:r>
-        <w:t>打開 interactive_graph.html。</w:t>
+        <w:t xml:space="preserve">打開 </w:t>
+      </w:r>
+      <w:r>
+        <w:rPr>
+          <w:rFonts w:ascii="Consolas" w:hAnsi="Consolas"/>
+          <w:color w:val="0E7490"/>
+          <w:sz w:val="19"/>
+        </w:rPr>
+        <w:t>interactive_graph.html</w:t>
+      </w:r>
+      <w:r>
+        <w:t>。</w:t>
       </w:r>
     </w:p>
     <w:p>
@@ -1376,7 +1308,18 @@
         <w:pStyle w:val="ListNumber"/>
       </w:pPr>
       <w:r>
-        <w:t>展示 analysis_summary.md 的 Top Entities。</w:t>
+        <w:t xml:space="preserve">展示 </w:t>
+      </w:r>
+      <w:r>
+        <w:rPr>
+          <w:rFonts w:ascii="Consolas" w:hAnsi="Consolas"/>
+          <w:color w:val="0E7490"/>
+          <w:sz w:val="19"/>
+        </w:rPr>
+        <w:t>analysis_summary.md</w:t>
+      </w:r>
+      <w:r>
+        <w:t xml:space="preserve"> 的 Top Entities。</w:t>
       </w:r>
     </w:p>
     <w:p>
@@ -1389,8 +1332,9 @@
     </w:p>
     <w:sectPr>
       <w:headerReference w:type="default" r:id="rId9"/>
+      <w:footerReference w:type="default" r:id="rId10"/>
       <w:pgSz w:w="12240" w:h="15840"/>
-      <w:pgMar w:top="1080" w:right="1152" w:bottom="1080" w:left="1152" w:header="720" w:footer="720" w:gutter="0"/>
+      <w:pgMar w:top="1224" w:right="1296" w:bottom="1224" w:left="1296" w:header="720" w:footer="720" w:gutter="0"/>
       <w:cols w:space="720"/>
       <w:docGrid w:linePitch="360"/>
     </w:sectPr>
@@ -1398,20 +1342,37 @@
 </w:document>
 </file>
 
+<file path=word/footer1.xml><?xml version="1.0" encoding="utf-8"?>
+<w:ftr xmlns:m="http://schemas.openxmlformats.org/officeDocument/2006/math" xmlns:mc="http://schemas.openxmlformats.org/markup-compatibility/2006" xmlns:mo="http://schemas.microsoft.com/office/mac/office/2008/main" xmlns:mv="urn:schemas-microsoft-com:mac:vml" xmlns:o="urn:schemas-microsoft-com:office:office" xmlns:r="http://schemas.openxmlformats.org/officeDocument/2006/relationships" xmlns:v="urn:schemas-microsoft-com:vml" xmlns:w10="urn:schemas-microsoft-com:office:word" xmlns:w14="http://schemas.microsoft.com/office/word/2010/wordml" xmlns:w="http://schemas.openxmlformats.org/wordprocessingml/2006/main" xmlns:wne="http://schemas.microsoft.com/office/word/2006/wordml" xmlns:wp14="http://schemas.microsoft.com/office/word/2010/wordprocessingDrawing" xmlns:wp="http://schemas.openxmlformats.org/drawingml/2006/wordprocessingDrawing" xmlns:wpc="http://schemas.microsoft.com/office/word/2010/wordprocessingCanvas" xmlns:wpg="http://schemas.microsoft.com/office/word/2010/wordprocessingGroup" xmlns:wpi="http://schemas.microsoft.com/office/word/2010/wordprocessingInk" xmlns:wps="http://schemas.microsoft.com/office/word/2010/wordprocessingShape" mc:Ignorable="w14 wp14">
+  <w:p>
+    <w:pPr>
+      <w:pStyle w:val="Footer"/>
+      <w:jc w:val="center"/>
+    </w:pPr>
+    <w:r>
+      <w:rPr>
+        <w:color w:val="64748B"/>
+        <w:sz w:val="18"/>
+      </w:rPr>
+      <w:t>?????? ????</w:t>
+    </w:r>
+  </w:p>
+</w:ftr>
+</file>
+
 <file path=word/header1.xml><?xml version="1.0" encoding="utf-8"?>
 <w:hdr xmlns:m="http://schemas.openxmlformats.org/officeDocument/2006/math" xmlns:mc="http://schemas.openxmlformats.org/markup-compatibility/2006" xmlns:mo="http://schemas.microsoft.com/office/mac/office/2008/main" xmlns:mv="urn:schemas-microsoft-com:mac:vml" xmlns:o="urn:schemas-microsoft-com:office:office" xmlns:r="http://schemas.openxmlformats.org/officeDocument/2006/relationships" xmlns:v="urn:schemas-microsoft-com:vml" xmlns:w10="urn:schemas-microsoft-com:office:word" xmlns:w14="http://schemas.microsoft.com/office/word/2010/wordml" xmlns:w="http://schemas.openxmlformats.org/wordprocessingml/2006/main" xmlns:wne="http://schemas.microsoft.com/office/word/2006/wordml" xmlns:wp14="http://schemas.microsoft.com/office/word/2010/wordprocessingDrawing" xmlns:wp="http://schemas.openxmlformats.org/drawingml/2006/wordprocessingDrawing" xmlns:wpc="http://schemas.microsoft.com/office/word/2010/wordprocessingCanvas" xmlns:wpg="http://schemas.microsoft.com/office/word/2010/wordprocessingGroup" xmlns:wpi="http://schemas.microsoft.com/office/word/2010/wordprocessingInk" xmlns:wps="http://schemas.microsoft.com/office/word/2010/wordprocessingShape" mc:Ignorable="w14 wp14">
   <w:p>
     <w:pPr>
       <w:pStyle w:val="Header"/>
-      <w:jc w:val="center"/>
+      <w:jc w:val="right"/>
     </w:pPr>
     <w:r>
       <w:rPr>
-        <w:rFonts w:ascii="Arial" w:hAnsi="Arial" w:eastAsia="Microsoft JhengHei"/>
-        <w:color w:val="5A5A5A"/>
+        <w:color w:val="64748B"/>
         <w:sz w:val="18"/>
       </w:rPr>
-      <w:t>Web3 Knowledge Graph ????</w:t>
+      <w:t>Web3 Knowledge Graph | Reddit Crawler ??</w:t>
     </w:r>
   </w:p>
 </w:hdr>
@@ -1780,9 +1741,6 @@
     <w:name w:val="Normal"/>
     <w:qFormat/>
     <w:rsid w:val="00FC693F"/>
-    <w:pPr>
-      <w:spacing w:after="100" w:line="259" w:lineRule="auto"/>
-    </w:pPr>
     <w:rPr>
       <w:rFonts w:ascii="Arial" w:hAnsi="Arial" w:eastAsia="Microsoft JhengHei"/>
       <w:sz w:val="21"/>
@@ -1850,7 +1808,7 @@
       <w:rFonts w:asciiTheme="majorHAnsi" w:eastAsiaTheme="majorEastAsia" w:hAnsiTheme="majorHAnsi" w:cstheme="majorBidi" w:ascii="Arial" w:hAnsi="Arial" w:eastAsia="Microsoft JhengHei"/>
       <w:b/>
       <w:bCs/>
-      <w:color w:val="1F4E79"/>
+      <w:color w:val="183653"/>
       <w:sz w:val="30"/>
       <w:szCs w:val="28"/>
     </w:rPr>
@@ -1874,8 +1832,8 @@
       <w:rFonts w:asciiTheme="majorHAnsi" w:eastAsiaTheme="majorEastAsia" w:hAnsiTheme="majorHAnsi" w:cstheme="majorBidi" w:ascii="Arial" w:hAnsi="Arial" w:eastAsia="Microsoft JhengHei"/>
       <w:b/>
       <w:bCs/>
-      <w:color w:val="2F5597"/>
-      <w:sz w:val="24"/>
+      <w:color w:val="2D5276"/>
+      <w:sz w:val="25"/>
       <w:szCs w:val="26"/>
     </w:rPr>
   </w:style>
@@ -2138,7 +2096,7 @@
     <w:rPr>
       <w:rFonts w:asciiTheme="majorHAnsi" w:eastAsiaTheme="majorEastAsia" w:hAnsiTheme="majorHAnsi" w:cstheme="majorBidi" w:ascii="Arial" w:hAnsi="Arial" w:eastAsia="Microsoft JhengHei"/>
       <w:b/>
-      <w:color w:val="1F4E79"/>
+      <w:color w:val="183653"/>
       <w:spacing w:val="5"/>
       <w:kern w:val="28"/>
       <w:sz w:val="44"/>

</xml_diff>